<commit_message>
Phase 2.2 result: phase-amplitude encoding HURTS (-72% total MC)
Head-to-head on the two persisted waveforms with identical memcap settings:
plain amplitude arcsin_sqrt totMC 10.81 (lin 4.25, nl 6.55) vs phase-amplitude
R_z(2pi*s).R_x(theta) totMC 3.06 (lin 1.01, nl 2.05) -> -72% (linear -76%,
nonlinear -69%; not a memory-for-nonlinearity trade). The extra R_z phase
rotation collapses the FID dynamic range, scrambling reservoir states instead of
adding independent directions -> plain amplitude encoding stays best.

- fig10_phaseamp.png (MC-spectrum bars + representative FID overlay)
- Encoding study: new sec 4.1 + Fig 10 (.md + regenerated .docx); future-work (i)
  marked resolved
- Status tracker (.md/.html): Phase-2.2 row + Phase-2 scoreboard -> DONE

Co-Authored-By: Claude Opus 4.8 (1M context) <noreply@anthropic.com>
</commit_message>
<xml_diff>
--- a/docs/QRC/QRC_Encoding_Study.docx
+++ b/docs/QRC/QRC_Encoding_Study.docx
@@ -1055,6 +1055,241 @@
     </w:p>
     <w:p>
       <w:pPr>
+        <w:pStyle w:val="Heading2"/>
+      </w:pPr>
+      <w:r>
+        <w:t>4.1 Phase-amplitude encoding does not help</w:t>
+      </w:r>
+    </w:p>
+    <w:p>
+      <w:r>
+        <w:rPr>
+          <w:i w:val="0"/>
+        </w:rPr>
+        <w:t>The seven functions all inject the input through a single amplitude channel R_x(θ(s)). A natural extension adds a second degree of freedom per input — a phase-amplitude pulse R_z(2π·s)·R_x(θ(s)) that also rotates each spin about z by an input-proportional angle. We tested this on the winning encoding (arcsin_sqrt) with a dedicated GPU run, then scored it against the plain-amplitude baseline by recomputing memory capacity on both persisted waveforms under identical settings (kmax=30, washout=10, n_pca=50, degrees 1–3):</w:t>
+      </w:r>
+    </w:p>
+    <w:tbl>
+      <w:tblPr>
+        <w:tblStyle w:val="LightGrid-Accent1"/>
+        <w:tblW w:type="auto" w:w="0"/>
+        <w:tblLook w:firstColumn="1" w:firstRow="1" w:lastColumn="0" w:lastRow="0" w:noHBand="0" w:noVBand="1" w:val="04A0"/>
+      </w:tblPr>
+      <w:tblGrid>
+        <w:gridCol w:w="2160"/>
+        <w:gridCol w:w="2160"/>
+        <w:gridCol w:w="2160"/>
+        <w:gridCol w:w="2160"/>
+      </w:tblGrid>
+      <w:tr>
+        <w:tc>
+          <w:tcPr>
+            <w:tcW w:type="dxa" w:w="2160"/>
+          </w:tcPr>
+          <w:p>
+            <w:r>
+              <w:rPr>
+                <w:b/>
+              </w:rPr>
+              <w:t>arcsin_sqrt variant</w:t>
+            </w:r>
+          </w:p>
+        </w:tc>
+        <w:tc>
+          <w:tcPr>
+            <w:tcW w:type="dxa" w:w="2160"/>
+          </w:tcPr>
+          <w:p>
+            <w:r>
+              <w:rPr>
+                <w:b/>
+              </w:rPr>
+              <w:t>linear MC</w:t>
+            </w:r>
+          </w:p>
+        </w:tc>
+        <w:tc>
+          <w:tcPr>
+            <w:tcW w:type="dxa" w:w="2160"/>
+          </w:tcPr>
+          <w:p>
+            <w:r>
+              <w:rPr>
+                <w:b/>
+              </w:rPr>
+              <w:t>nonlinear MC</w:t>
+            </w:r>
+          </w:p>
+        </w:tc>
+        <w:tc>
+          <w:tcPr>
+            <w:tcW w:type="dxa" w:w="2160"/>
+          </w:tcPr>
+          <w:p>
+            <w:r>
+              <w:rPr>
+                <w:b/>
+              </w:rPr>
+              <w:t>total MC</w:t>
+            </w:r>
+          </w:p>
+        </w:tc>
+      </w:tr>
+      <w:tr>
+        <w:tc>
+          <w:tcPr>
+            <w:tcW w:type="dxa" w:w="2160"/>
+          </w:tcPr>
+          <w:p>
+            <w:r>
+              <w:rPr>
+                <w:b/>
+              </w:rPr>
+              <w:t>amplitude only  R_x(θ)</w:t>
+            </w:r>
+          </w:p>
+        </w:tc>
+        <w:tc>
+          <w:tcPr>
+            <w:tcW w:type="dxa" w:w="2160"/>
+          </w:tcPr>
+          <w:p>
+            <w:r>
+              <w:rPr>
+                <w:b/>
+              </w:rPr>
+              <w:t>4.25</w:t>
+            </w:r>
+          </w:p>
+        </w:tc>
+        <w:tc>
+          <w:tcPr>
+            <w:tcW w:type="dxa" w:w="2160"/>
+          </w:tcPr>
+          <w:p>
+            <w:r>
+              <w:rPr>
+                <w:b/>
+              </w:rPr>
+              <w:t>6.55</w:t>
+            </w:r>
+          </w:p>
+        </w:tc>
+        <w:tc>
+          <w:tcPr>
+            <w:tcW w:type="dxa" w:w="2160"/>
+          </w:tcPr>
+          <w:p>
+            <w:r>
+              <w:rPr>
+                <w:b/>
+              </w:rPr>
+              <w:t>10.81</w:t>
+            </w:r>
+          </w:p>
+        </w:tc>
+      </w:tr>
+      <w:tr>
+        <w:tc>
+          <w:tcPr>
+            <w:tcW w:type="dxa" w:w="2160"/>
+          </w:tcPr>
+          <w:p>
+            <w:r>
+              <w:t>+ phase-amplitude  R_z(2πs)·R_x(θ)</w:t>
+            </w:r>
+          </w:p>
+        </w:tc>
+        <w:tc>
+          <w:tcPr>
+            <w:tcW w:type="dxa" w:w="2160"/>
+          </w:tcPr>
+          <w:p>
+            <w:r>
+              <w:t>1.01</w:t>
+            </w:r>
+          </w:p>
+        </w:tc>
+        <w:tc>
+          <w:tcPr>
+            <w:tcW w:type="dxa" w:w="2160"/>
+          </w:tcPr>
+          <w:p>
+            <w:r>
+              <w:t>2.05</w:t>
+            </w:r>
+          </w:p>
+        </w:tc>
+        <w:tc>
+          <w:tcPr>
+            <w:tcW w:type="dxa" w:w="2160"/>
+          </w:tcPr>
+          <w:p>
+            <w:r>
+              <w:t>3.06</w:t>
+            </w:r>
+          </w:p>
+        </w:tc>
+      </w:tr>
+    </w:tbl>
+    <w:p>
+      <w:r>
+        <w:drawing>
+          <wp:inline xmlns:a="http://schemas.openxmlformats.org/drawingml/2006/main" xmlns:pic="http://schemas.openxmlformats.org/drawingml/2006/picture">
+            <wp:extent cx="5669280" cy="2356933"/>
+            <wp:docPr id="2" name="Picture 2"/>
+            <wp:cNvGraphicFramePr>
+              <a:graphicFrameLocks noChangeAspect="1"/>
+            </wp:cNvGraphicFramePr>
+            <a:graphic>
+              <a:graphicData uri="http://schemas.openxmlformats.org/drawingml/2006/picture">
+                <pic:pic>
+                  <pic:nvPicPr>
+                    <pic:cNvPr id="0" name="fig10_phaseamp.png"/>
+                    <pic:cNvPicPr/>
+                  </pic:nvPicPr>
+                  <pic:blipFill>
+                    <a:blip r:embed="rId10"/>
+                    <a:stretch>
+                      <a:fillRect/>
+                    </a:stretch>
+                  </pic:blipFill>
+                  <pic:spPr>
+                    <a:xfrm>
+                      <a:off x="0" y="0"/>
+                      <a:ext cx="5669280" cy="2356933"/>
+                    </a:xfrm>
+                    <a:prstGeom prst="rect"/>
+                  </pic:spPr>
+                </pic:pic>
+              </a:graphicData>
+            </a:graphic>
+          </wp:inline>
+        </w:drawing>
+      </w:r>
+    </w:p>
+    <w:p>
+      <w:pPr>
+        <w:jc w:val="center"/>
+      </w:pPr>
+      <w:r>
+        <w:rPr>
+          <w:i/>
+          <w:sz w:val="18"/>
+        </w:rPr>
+        <w:t>Figure 10: (A) memory-capacity spectrum, identical settings on both persisted waveforms; (B) representative FID at step 105 — the phase-amp trace is compressed relative to amplitude-only.</w:t>
+      </w:r>
+    </w:p>
+    <w:p>
+      <w:r>
+        <w:rPr>
+          <w:i w:val="0"/>
+        </w:rPr>
+        <w:t>Adding the phase channel reduces total capacity by ≈72% — and it hurts both the linear (−76%) and nonlinear (−69%) components, so it is not a memory-for-nonlinearity trade. The extra R_z(2π·s) rotation collapses the FID dynamic range: it drives the encoded states toward a smaller, more scrambled region of the readout manifold rather than spreading them into new independent directions. For this NMR reservoir and its FID-magnitude/quadrature readout, the phase degree of freedom is not observable in a way that adds reservoir information — it only dilutes the amplitude signal arcsin√ had already placed optimally. Plain amplitude encoding remains the best choice; the second channel is counter-productive here. (Single-seed, quick fidelity, as in §5 limitations; the ≈3.5× gap makes the direction robust to noise.)</w:t>
+      </w:r>
+    </w:p>
+    <w:p>
+      <w:pPr>
         <w:pStyle w:val="Heading1"/>
       </w:pPr>
       <w:r>
@@ -1124,7 +1359,7 @@
         <w:t xml:space="preserve">Future work. </w:t>
       </w:r>
       <w:r>
-        <w:t>(i) Phase-amplitude encoding R_z(2πs)·R_x(θ) — the judging harness scores it automatically. (ii) Learned encoding (GRAPE / gradient optimization): this fixed-function comparison is the empirical baseline for optimizing a parametrized encoding pulse directly; the GPU stepper is autodiff-capable (torch), so an end-to-end differentiable-QRC optimizer is buildable here with the MC metric as objective — a planned dedicated study. (iii) Encoding×feature interaction. (iv) Higher-fidelity, multi-seed confirmation.</w:t>
+        <w:t>(i) Phase-amplitude encoding R_z(2πs)·R_x(θ) — resolved (§4.1): it lowers capacity by ≈72%, so a second (phase) channel is not the way to beat arcsin√ on this system. (ii) Learned encoding (GRAPE / gradient optimization): this fixed-function comparison is the empirical baseline for optimizing a parametrized encoding pulse directly; the GPU stepper is autodiff-capable (torch), so an end-to-end differentiable-QRC optimizer is buildable here with the MC metric as objective — a planned dedicated study. (iii) Encoding×feature interaction. (iv) Higher-fidelity, multi-seed confirmation.</w:t>
       </w:r>
     </w:p>
     <w:p>

</xml_diff>

<commit_message>
Stacked clean levers: best quantum-mediated config 0.058 (sec 7.1)
The three quantum-clean levers (learned per-spin encoding + coupling + correlation
readout) compound on NARMA-2 (6-qubit, T=600): learned per-spin alone 0.152 ->
stacked 0.058 (-61% further, -73% vs 0.216 open-loop). All operate through the
reservoir's own dynamics/readout with a broadcast scalar input, so no explicit
classical memory is injected -- the result is quantum-mediated (tau->0 collapses
it), unlike the window/feedback/spatial family. Narrows the classical gap from
~20x to ~5x (best classical ~0.011) without crossing it on this deterministic task.

Added manuscript sec 7.1 (.md + regenerated .docx) + tracker row.

Co-Authored-By: Claude Opus 4.8 (1M context) <noreply@anthropic.com>
</commit_message>
<xml_diff>
--- a/docs/QRC/QRC_Encoding_Study.docx
+++ b/docs/QRC/QRC_Encoding_Study.docx
@@ -2187,6 +2187,22 @@
     </w:p>
     <w:p>
       <w:pPr>
+        <w:pStyle w:val="Heading2"/>
+      </w:pPr>
+      <w:r>
+        <w:t>7.1 Stacking the clean levers</w:t>
+      </w:r>
+    </w:p>
+    <w:p>
+      <w:r>
+        <w:rPr>
+          <w:i w:val="0"/>
+        </w:rPr>
+        <w:t>The three quantum-clean levers -- learned per-spin encoding (section 6, input), coupling strength (dynamics), and correlation readout (section 7, output) -- are complementary and compound. On NARMA-2 (6-qubit, T=600): learned per-spin alone reaches 0.152; adding 2x coupling and 2-body correlation readout drops it to 0.058 (a further -61%, and -73% vs the 0.216 open-loop number). None of these levers injects explicit classical memory -- the encoding is a broadcast scalar, and coupling/correlation act only through the reservoir's own dynamics and joint readout -- so the memory still lives in the quantum state (a tau-&gt;0 ablation collapses it). 0.058 is thus the best honest, quantum-mediated reservoir configuration. It narrows the gap to the best classical model (~0.011; section 8) from ~20x (open-loop) to ~5x, without crossing it on this deterministic task: the improvements are real and quantum-mediated, but they optimize a reservoir that remains, for classical-friendly tasks, behind a trained recurrent model.</w:t>
+      </w:r>
+    </w:p>
+    <w:p>
+      <w:pPr>
         <w:pStyle w:val="Heading1"/>
       </w:pPr>
       <w:r>

</xml_diff>